<commit_message>
Fixed SRD and included more information
</commit_message>
<xml_diff>
--- a/SRD_Template.docx
+++ b/SRD_Template.docx
@@ -64,7 +64,7 @@
           <w:caps/>
           <w:u w:val="single"/>
         </w:rPr>
-        <w:t>[Insert Project Name Here]</w:t>
+        <w:t>clr</w:t>
       </w:r>
     </w:p>
     <w:p>
@@ -140,7 +140,13 @@
         <w:rPr>
           <w:caps/>
         </w:rPr>
-        <w:t xml:space="preserve"> [e.g., Spring 2026]</w:t>
+        <w:t xml:space="preserve"> </w:t>
+      </w:r>
+      <w:r>
+        <w:rPr>
+          <w:caps/>
+        </w:rPr>
+        <w:t>Fall 2026</w:t>
       </w:r>
     </w:p>
     <w:p>
@@ -162,7 +168,13 @@
         <w:rPr>
           <w:caps/>
         </w:rPr>
-        <w:t xml:space="preserve"> [Section Number]</w:t>
+        <w:t xml:space="preserve"> </w:t>
+      </w:r>
+      <w:r>
+        <w:rPr>
+          <w:caps/>
+        </w:rPr>
+        <w:t>03</w:t>
       </w:r>
     </w:p>
     <w:p>
@@ -214,19 +226,25 @@
         <w:rPr>
           <w:caps/>
         </w:rPr>
-        <w:t xml:space="preserve"> [Name] — [Role, e.g., </w:t>
-      </w:r>
-      <w:r>
-        <w:rPr>
-          <w:caps/>
-        </w:rPr>
-        <w:t>App</w:t>
-      </w:r>
-      <w:r>
-        <w:rPr>
-          <w:caps/>
-        </w:rPr>
-        <w:t xml:space="preserve"> Architect]</w:t>
+        <w:t xml:space="preserve"> </w:t>
+      </w:r>
+      <w:r>
+        <w:rPr>
+          <w:caps/>
+        </w:rPr>
+        <w:t>Jonathan Resendiz</w:t>
+      </w:r>
+      <w:r>
+        <w:rPr>
+          <w:caps/>
+        </w:rPr>
+        <w:t xml:space="preserve"> — </w:t>
+      </w:r>
+      <w:r>
+        <w:rPr>
+          <w:caps/>
+        </w:rPr>
+        <w:t>Scrum Master</w:t>
       </w:r>
     </w:p>
     <w:p>
@@ -252,76 +270,26 @@
         <w:rPr>
           <w:caps/>
         </w:rPr>
-        <w:t xml:space="preserve"> [</w:t>
-      </w:r>
-      <w:proofErr w:type="gramStart"/>
-      <w:r>
-        <w:rPr>
-          <w:caps/>
-        </w:rPr>
-        <w:t>Name] —</w:t>
-      </w:r>
-      <w:proofErr w:type="gramEnd"/>
-      <w:r>
-        <w:rPr>
-          <w:caps/>
-        </w:rPr>
-        <w:t xml:space="preserve"> [Role, e.g., API Developer]</w:t>
-      </w:r>
-    </w:p>
-    <w:p>
-      <w:pPr>
-        <w:numPr>
-          <w:ilvl w:val="0"/>
-          <w:numId w:val="2"/>
-        </w:numPr>
-        <w:spacing w:line="360" w:lineRule="auto"/>
-        <w:rPr>
-          <w:caps/>
-        </w:rPr>
-      </w:pPr>
-      <w:r>
-        <w:rPr>
-          <w:b/>
-          <w:bCs/>
-          <w:caps/>
-        </w:rPr>
-        <w:t>Student C:</w:t>
-      </w:r>
-      <w:r>
-        <w:rPr>
-          <w:caps/>
-        </w:rPr>
         <w:t xml:space="preserve"> </w:t>
       </w:r>
       <w:r>
         <w:rPr>
           <w:caps/>
         </w:rPr>
-        <w:t xml:space="preserve">[Name] — [Role, e.g., </w:t>
-      </w:r>
-      <w:r>
-        <w:rPr>
-          <w:caps/>
-        </w:rPr>
-        <w:t>Scrum Master</w:t>
-      </w:r>
-      <w:r>
-        <w:rPr>
-          <w:caps/>
-        </w:rPr>
-        <w:t>]</w:t>
-      </w:r>
-    </w:p>
-    <w:p>
-      <w:pPr>
-        <w:spacing w:line="360" w:lineRule="auto"/>
-        <w:rPr>
-          <w:b/>
-          <w:bCs/>
-          <w:caps/>
-        </w:rPr>
-      </w:pPr>
+        <w:t>Andy cai</w:t>
+      </w:r>
+      <w:r>
+        <w:rPr>
+          <w:caps/>
+        </w:rPr>
+        <w:t xml:space="preserve"> — </w:t>
+      </w:r>
+      <w:r>
+        <w:rPr>
+          <w:caps/>
+        </w:rPr>
+        <w:t>Product owner</w:t>
+      </w:r>
     </w:p>
     <w:p>
       <w:pPr>
@@ -362,8 +330,17 @@
         <w:rPr>
           <w:caps/>
         </w:rPr>
-        <w:t xml:space="preserve"> [Link]</w:t>
-      </w:r>
+        <w:t xml:space="preserve"> </w:t>
+      </w:r>
+      <w:hyperlink r:id="rId8" w:history="1">
+        <w:r>
+          <w:rPr>
+            <w:rStyle w:val="Hyperlink"/>
+            <w:caps/>
+          </w:rPr>
+          <w:t>https://github.com/jrhamburger/CLR</w:t>
+        </w:r>
+      </w:hyperlink>
     </w:p>
     <w:p>
       <w:pPr>
@@ -388,7 +365,25 @@
         <w:rPr>
           <w:caps/>
         </w:rPr>
-        <w:t xml:space="preserve"> [Link to Live Site]</w:t>
+        <w:t xml:space="preserve"> [</w:t>
+      </w:r>
+      <w:r>
+        <w:rPr>
+          <w:caps/>
+        </w:rPr>
+        <w:t>to be deployed on vercel</w:t>
+      </w:r>
+      <w:r>
+        <w:rPr>
+          <w:caps/>
+        </w:rPr>
+        <w:t>/hasn’t been deployed yet</w:t>
+      </w:r>
+      <w:r>
+        <w:rPr>
+          <w:caps/>
+        </w:rPr>
+        <w:t>]</w:t>
       </w:r>
     </w:p>
     <w:p>
@@ -471,13 +466,7 @@
               <w:rPr>
                 <w:caps/>
               </w:rPr>
-              <w:t>Who</w:t>
-            </w:r>
-            <w:r>
-              <w:rPr>
-                <w:caps/>
-              </w:rPr>
-              <w:t>:</w:t>
+              <w:t>Who:</w:t>
             </w:r>
           </w:p>
         </w:tc>
@@ -513,6 +502,130 @@
                 <w:caps/>
               </w:rPr>
             </w:pPr>
+            <w:r>
+              <w:rPr>
+                <w:caps/>
+              </w:rPr>
+              <w:t>09/25/26</w:t>
+            </w:r>
+          </w:p>
+        </w:tc>
+        <w:tc>
+          <w:tcPr>
+            <w:tcW w:w="2874" w:type="dxa"/>
+          </w:tcPr>
+          <w:p>
+            <w:pPr>
+              <w:spacing w:line="360" w:lineRule="auto"/>
+              <w:rPr>
+                <w:caps/>
+              </w:rPr>
+            </w:pPr>
+            <w:r>
+              <w:rPr>
+                <w:caps/>
+              </w:rPr>
+              <w:t>jonathan</w:t>
+            </w:r>
+          </w:p>
+        </w:tc>
+        <w:tc>
+          <w:tcPr>
+            <w:tcW w:w="3103" w:type="dxa"/>
+          </w:tcPr>
+          <w:p>
+            <w:pPr>
+              <w:spacing w:line="360" w:lineRule="auto"/>
+              <w:rPr>
+                <w:caps/>
+              </w:rPr>
+            </w:pPr>
+            <w:r>
+              <w:rPr>
+                <w:caps/>
+              </w:rPr>
+              <w:t>Added user stories</w:t>
+            </w:r>
+          </w:p>
+        </w:tc>
+      </w:tr>
+      <w:tr>
+        <w:tc>
+          <w:tcPr>
+            <w:tcW w:w="3373" w:type="dxa"/>
+          </w:tcPr>
+          <w:p>
+            <w:pPr>
+              <w:spacing w:line="360" w:lineRule="auto"/>
+              <w:rPr>
+                <w:caps/>
+              </w:rPr>
+            </w:pPr>
+            <w:r>
+              <w:rPr>
+                <w:caps/>
+              </w:rPr>
+              <w:t>10/12/26</w:t>
+            </w:r>
+          </w:p>
+        </w:tc>
+        <w:tc>
+          <w:tcPr>
+            <w:tcW w:w="2874" w:type="dxa"/>
+          </w:tcPr>
+          <w:p>
+            <w:pPr>
+              <w:spacing w:line="360" w:lineRule="auto"/>
+              <w:rPr>
+                <w:caps/>
+              </w:rPr>
+            </w:pPr>
+            <w:r>
+              <w:rPr>
+                <w:caps/>
+              </w:rPr>
+              <w:t>jonathan</w:t>
+            </w:r>
+          </w:p>
+        </w:tc>
+        <w:tc>
+          <w:tcPr>
+            <w:tcW w:w="3103" w:type="dxa"/>
+          </w:tcPr>
+          <w:p>
+            <w:pPr>
+              <w:spacing w:line="360" w:lineRule="auto"/>
+              <w:rPr>
+                <w:caps/>
+              </w:rPr>
+            </w:pPr>
+            <w:r>
+              <w:rPr>
+                <w:caps/>
+              </w:rPr>
+              <w:t>added specific information about project such as project name and details</w:t>
+            </w:r>
+            <w:r>
+              <w:rPr>
+                <w:caps/>
+              </w:rPr>
+              <w:t xml:space="preserve"> regarding project</w:t>
+            </w:r>
+          </w:p>
+        </w:tc>
+      </w:tr>
+      <w:tr>
+        <w:tc>
+          <w:tcPr>
+            <w:tcW w:w="3373" w:type="dxa"/>
+          </w:tcPr>
+          <w:p>
+            <w:pPr>
+              <w:spacing w:line="360" w:lineRule="auto"/>
+              <w:rPr>
+                <w:caps/>
+              </w:rPr>
+            </w:pPr>
           </w:p>
         </w:tc>
         <w:tc>
@@ -583,88 +696,6 @@
           </w:p>
         </w:tc>
       </w:tr>
-      <w:tr>
-        <w:tc>
-          <w:tcPr>
-            <w:tcW w:w="3373" w:type="dxa"/>
-          </w:tcPr>
-          <w:p>
-            <w:pPr>
-              <w:spacing w:line="360" w:lineRule="auto"/>
-              <w:rPr>
-                <w:caps/>
-              </w:rPr>
-            </w:pPr>
-          </w:p>
-        </w:tc>
-        <w:tc>
-          <w:tcPr>
-            <w:tcW w:w="2874" w:type="dxa"/>
-          </w:tcPr>
-          <w:p>
-            <w:pPr>
-              <w:spacing w:line="360" w:lineRule="auto"/>
-              <w:rPr>
-                <w:caps/>
-              </w:rPr>
-            </w:pPr>
-          </w:p>
-        </w:tc>
-        <w:tc>
-          <w:tcPr>
-            <w:tcW w:w="3103" w:type="dxa"/>
-          </w:tcPr>
-          <w:p>
-            <w:pPr>
-              <w:spacing w:line="360" w:lineRule="auto"/>
-              <w:rPr>
-                <w:caps/>
-              </w:rPr>
-            </w:pPr>
-          </w:p>
-        </w:tc>
-      </w:tr>
-      <w:tr>
-        <w:tc>
-          <w:tcPr>
-            <w:tcW w:w="3373" w:type="dxa"/>
-          </w:tcPr>
-          <w:p>
-            <w:pPr>
-              <w:spacing w:line="360" w:lineRule="auto"/>
-              <w:rPr>
-                <w:caps/>
-              </w:rPr>
-            </w:pPr>
-          </w:p>
-        </w:tc>
-        <w:tc>
-          <w:tcPr>
-            <w:tcW w:w="2874" w:type="dxa"/>
-          </w:tcPr>
-          <w:p>
-            <w:pPr>
-              <w:spacing w:line="360" w:lineRule="auto"/>
-              <w:rPr>
-                <w:caps/>
-              </w:rPr>
-            </w:pPr>
-          </w:p>
-        </w:tc>
-        <w:tc>
-          <w:tcPr>
-            <w:tcW w:w="3103" w:type="dxa"/>
-          </w:tcPr>
-          <w:p>
-            <w:pPr>
-              <w:spacing w:line="360" w:lineRule="auto"/>
-              <w:rPr>
-                <w:caps/>
-              </w:rPr>
-            </w:pPr>
-          </w:p>
-        </w:tc>
-      </w:tr>
     </w:tbl>
     <w:p>
       <w:pPr>
@@ -721,7 +752,7 @@
           <w:bCs/>
           <w:caps/>
         </w:rPr>
-        <w:t>[Project Title]</w:t>
+        <w:t>AuxShare-project</w:t>
       </w:r>
     </w:p>
     <w:p>
@@ -757,7 +788,15 @@
           <w:bCs/>
           <w:caps/>
         </w:rPr>
-        <w:t>Course: [Course Name/Number]</w:t>
+        <w:t xml:space="preserve">Course: </w:t>
+      </w:r>
+      <w:r>
+        <w:rPr>
+          <w:b/>
+          <w:bCs/>
+          <w:caps/>
+        </w:rPr>
+        <w:t>Csc3100</w:t>
       </w:r>
     </w:p>
     <w:p>
@@ -1714,7 +1753,14 @@
           <w:caps/>
           <w:u w:val="single"/>
         </w:rPr>
-        <w:t xml:space="preserve"> What specific problem are you solving?</w:t>
+        <w:t xml:space="preserve"> </w:t>
+      </w:r>
+      <w:r>
+        <w:rPr>
+          <w:caps/>
+          <w:u w:val="single"/>
+        </w:rPr>
+        <w:t>How can we design and build a music player that is more personal and fun to use while still being functional?</w:t>
       </w:r>
     </w:p>
     <w:p>
@@ -1743,7 +1789,14 @@
           <w:caps/>
           <w:u w:val="single"/>
         </w:rPr>
-        <w:t xml:space="preserve"> Who are the stakeholders?</w:t>
+        <w:t xml:space="preserve"> </w:t>
+      </w:r>
+      <w:r>
+        <w:rPr>
+          <w:caps/>
+          <w:u w:val="single"/>
+        </w:rPr>
+        <w:t>college students, people who workout, daily commuters, etc.</w:t>
       </w:r>
     </w:p>
     <w:p>
@@ -1772,7 +1825,80 @@
           <w:caps/>
           <w:u w:val="single"/>
         </w:rPr>
-        <w:t xml:space="preserve"> what is the scope of this project?</w:t>
+        <w:t xml:space="preserve"> build an music application that’s fun and easy for everyone to use that allows sharing/discovering music </w:t>
+      </w:r>
+      <w:r>
+        <w:rPr>
+          <w:caps/>
+          <w:u w:val="single"/>
+        </w:rPr>
+        <w:t xml:space="preserve">using an algorithm </w:t>
+      </w:r>
+      <w:r>
+        <w:rPr>
+          <w:caps/>
+          <w:u w:val="single"/>
+        </w:rPr>
+        <w:t>and letting users upload their own music for listening.</w:t>
+      </w:r>
+      <w:r>
+        <w:rPr>
+          <w:caps/>
+          <w:u w:val="single"/>
+        </w:rPr>
+        <w:t xml:space="preserve"> SOme constraints are the amount of work that it wouldtake to implement desired features and learning new technologies to implement an attractive interface. Also, implementing certain algorithms might be difficult depending on what the project requires.</w:t>
+      </w:r>
+    </w:p>
+    <w:p>
+      <w:pPr>
+        <w:numPr>
+          <w:ilvl w:val="0"/>
+          <w:numId w:val="5"/>
+        </w:numPr>
+        <w:spacing w:line="360" w:lineRule="auto"/>
+        <w:rPr>
+          <w:caps/>
+          <w:u w:val="single"/>
+        </w:rPr>
+      </w:pPr>
+      <w:r>
+        <w:rPr>
+          <w:b/>
+          <w:bCs/>
+          <w:caps/>
+          <w:u w:val="single"/>
+        </w:rPr>
+        <w:t>Product Vision:</w:t>
+      </w:r>
+      <w:r>
+        <w:rPr>
+          <w:caps/>
+          <w:u w:val="single"/>
+        </w:rPr>
+        <w:t xml:space="preserve"> </w:t>
+      </w:r>
+      <w:r>
+        <w:rPr>
+          <w:caps/>
+          <w:u w:val="single"/>
+        </w:rPr>
+        <w:t xml:space="preserve">For music enthusiasts who want to share and discover songs within their social circle or meet new people with similar music tastes. </w:t>
+      </w:r>
+      <w:r>
+        <w:rPr>
+          <w:b/>
+          <w:bCs/>
+          <w:caps/>
+          <w:u w:val="single"/>
+        </w:rPr>
+        <w:t>AuxShare</w:t>
+      </w:r>
+      <w:r>
+        <w:rPr>
+          <w:caps/>
+          <w:u w:val="single"/>
+        </w:rPr>
+        <w:t xml:space="preserve"> is a social music sharing app, which lets users connect with friends and share music in real time. Unlike Spotify's built-in social features / Instagram Stories, our product is built specifically around music discovery through your friend network, not general social media.</w:t>
       </w:r>
     </w:p>
     <w:p>
@@ -1873,14 +1999,14 @@
           <w:caps/>
           <w:u w:val="single"/>
         </w:rPr>
-        <w:t xml:space="preserve"> Authenticat</w:t>
-      </w:r>
-      <w:r>
-        <w:rPr>
-          <w:caps/>
-          <w:u w:val="single"/>
-        </w:rPr>
-        <w:t>ion</w:t>
+        <w:t xml:space="preserve"> </w:t>
+      </w:r>
+      <w:r>
+        <w:rPr>
+          <w:caps/>
+          <w:u w:val="single"/>
+        </w:rPr>
+        <w:t>listener survey</w:t>
       </w:r>
     </w:p>
     <w:p>
@@ -1925,14 +2051,7 @@
           <w:caps/>
           <w:u w:val="single"/>
         </w:rPr>
-        <w:t>store</w:t>
-      </w:r>
-      <w:r>
-        <w:rPr>
-          <w:caps/>
-          <w:u w:val="single"/>
-        </w:rPr>
-        <w:t xml:space="preserve"> Workout_Log.</w:t>
+        <w:t>playlist creation &amp; customization</w:t>
       </w:r>
     </w:p>
     <w:p>
@@ -1977,7 +2096,203 @@
           <w:caps/>
           <w:u w:val="single"/>
         </w:rPr>
-        <w:t xml:space="preserve">search history </w:t>
+        <w:t>Concert Recommendations</w:t>
+      </w:r>
+    </w:p>
+    <w:p>
+      <w:pPr>
+        <w:numPr>
+          <w:ilvl w:val="0"/>
+          <w:numId w:val="6"/>
+        </w:numPr>
+        <w:spacing w:line="360" w:lineRule="auto"/>
+        <w:rPr>
+          <w:b/>
+          <w:bCs/>
+          <w:caps/>
+          <w:u w:val="single"/>
+        </w:rPr>
+      </w:pPr>
+      <w:r>
+        <w:rPr>
+          <w:b/>
+          <w:bCs/>
+          <w:caps/>
+          <w:u w:val="single"/>
+        </w:rPr>
+        <w:t>us-04:</w:t>
+      </w:r>
+      <w:r>
+        <w:rPr>
+          <w:b/>
+          <w:bCs/>
+          <w:caps/>
+          <w:u w:val="single"/>
+        </w:rPr>
+        <w:t xml:space="preserve"> Music sharing (one-on-one)</w:t>
+      </w:r>
+    </w:p>
+    <w:p>
+      <w:pPr>
+        <w:numPr>
+          <w:ilvl w:val="0"/>
+          <w:numId w:val="6"/>
+        </w:numPr>
+        <w:spacing w:line="360" w:lineRule="auto"/>
+        <w:rPr>
+          <w:b/>
+          <w:bCs/>
+          <w:caps/>
+          <w:u w:val="single"/>
+        </w:rPr>
+      </w:pPr>
+      <w:r>
+        <w:rPr>
+          <w:b/>
+          <w:bCs/>
+          <w:caps/>
+          <w:u w:val="single"/>
+        </w:rPr>
+        <w:t>us-05: Group sharing</w:t>
+      </w:r>
+    </w:p>
+    <w:p>
+      <w:pPr>
+        <w:numPr>
+          <w:ilvl w:val="0"/>
+          <w:numId w:val="6"/>
+        </w:numPr>
+        <w:spacing w:line="360" w:lineRule="auto"/>
+        <w:rPr>
+          <w:b/>
+          <w:bCs/>
+          <w:caps/>
+          <w:u w:val="single"/>
+        </w:rPr>
+      </w:pPr>
+      <w:r>
+        <w:rPr>
+          <w:b/>
+          <w:bCs/>
+          <w:caps/>
+          <w:u w:val="single"/>
+        </w:rPr>
+        <w:t>Us-06: Play &amp; pause</w:t>
+      </w:r>
+    </w:p>
+    <w:p>
+      <w:pPr>
+        <w:numPr>
+          <w:ilvl w:val="0"/>
+          <w:numId w:val="6"/>
+        </w:numPr>
+        <w:spacing w:line="360" w:lineRule="auto"/>
+        <w:rPr>
+          <w:b/>
+          <w:bCs/>
+          <w:caps/>
+          <w:u w:val="single"/>
+        </w:rPr>
+      </w:pPr>
+      <w:r>
+        <w:rPr>
+          <w:b/>
+          <w:bCs/>
+          <w:caps/>
+          <w:u w:val="single"/>
+        </w:rPr>
+        <w:lastRenderedPageBreak/>
+        <w:t>US-07: Friend requests &amp; social music discovery</w:t>
+      </w:r>
+    </w:p>
+    <w:p>
+      <w:pPr>
+        <w:numPr>
+          <w:ilvl w:val="0"/>
+          <w:numId w:val="6"/>
+        </w:numPr>
+        <w:spacing w:line="360" w:lineRule="auto"/>
+        <w:rPr>
+          <w:b/>
+          <w:bCs/>
+          <w:caps/>
+          <w:u w:val="single"/>
+        </w:rPr>
+      </w:pPr>
+      <w:r>
+        <w:rPr>
+          <w:b/>
+          <w:bCs/>
+          <w:caps/>
+          <w:u w:val="single"/>
+        </w:rPr>
+        <w:t xml:space="preserve">us-08: </w:t>
+      </w:r>
+      <w:r>
+        <w:rPr>
+          <w:b/>
+          <w:bCs/>
+          <w:caps/>
+          <w:u w:val="single"/>
+        </w:rPr>
+        <w:t>listening</w:t>
+      </w:r>
+      <w:r>
+        <w:rPr>
+          <w:b/>
+          <w:bCs/>
+          <w:caps/>
+          <w:u w:val="single"/>
+        </w:rPr>
+        <w:t xml:space="preserve"> history</w:t>
+      </w:r>
+    </w:p>
+    <w:p>
+      <w:pPr>
+        <w:numPr>
+          <w:ilvl w:val="0"/>
+          <w:numId w:val="6"/>
+        </w:numPr>
+        <w:spacing w:line="360" w:lineRule="auto"/>
+        <w:rPr>
+          <w:b/>
+          <w:bCs/>
+          <w:caps/>
+          <w:u w:val="single"/>
+        </w:rPr>
+      </w:pPr>
+      <w:r>
+        <w:rPr>
+          <w:b/>
+          <w:bCs/>
+          <w:caps/>
+          <w:u w:val="single"/>
+        </w:rPr>
+        <w:t>us-09: commenting &amp; reacting</w:t>
+      </w:r>
+    </w:p>
+    <w:p>
+      <w:pPr>
+        <w:numPr>
+          <w:ilvl w:val="0"/>
+          <w:numId w:val="6"/>
+        </w:numPr>
+        <w:spacing w:line="360" w:lineRule="auto"/>
+        <w:rPr>
+          <w:b/>
+          <w:bCs/>
+          <w:caps/>
+          <w:u w:val="single"/>
+        </w:rPr>
+      </w:pPr>
+      <w:r>
+        <w:rPr>
+          <w:b/>
+          <w:bCs/>
+          <w:caps/>
+          <w:u w:val="single"/>
+        </w:rPr>
+        <w:t>us-10: accessing shared song links &amp; metadata</w:t>
       </w:r>
     </w:p>
     <w:tbl>
@@ -1988,14 +2303,14 @@
         <w:tblLook w:val="04A0" w:firstRow="1" w:lastRow="0" w:firstColumn="1" w:lastColumn="0" w:noHBand="0" w:noVBand="1"/>
       </w:tblPr>
       <w:tblGrid>
-        <w:gridCol w:w="2898"/>
-        <w:gridCol w:w="2866"/>
-        <w:gridCol w:w="2866"/>
+        <w:gridCol w:w="1075"/>
+        <w:gridCol w:w="6210"/>
+        <w:gridCol w:w="1345"/>
       </w:tblGrid>
       <w:tr>
         <w:tc>
           <w:tcPr>
-            <w:tcW w:w="2898" w:type="dxa"/>
+            <w:tcW w:w="1075" w:type="dxa"/>
           </w:tcPr>
           <w:p>
             <w:pPr>
@@ -2014,7 +2329,7 @@
         </w:tc>
         <w:tc>
           <w:tcPr>
-            <w:tcW w:w="2866" w:type="dxa"/>
+            <w:tcW w:w="6210" w:type="dxa"/>
           </w:tcPr>
           <w:p>
             <w:pPr>
@@ -2033,7 +2348,7 @@
         </w:tc>
         <w:tc>
           <w:tcPr>
-            <w:tcW w:w="2866" w:type="dxa"/>
+            <w:tcW w:w="1345" w:type="dxa"/>
           </w:tcPr>
           <w:p>
             <w:pPr>
@@ -2054,7 +2369,7 @@
       <w:tr>
         <w:tc>
           <w:tcPr>
-            <w:tcW w:w="2898" w:type="dxa"/>
+            <w:tcW w:w="1075" w:type="dxa"/>
           </w:tcPr>
           <w:p>
             <w:pPr>
@@ -2080,7 +2395,7 @@
         </w:tc>
         <w:tc>
           <w:tcPr>
-            <w:tcW w:w="2866" w:type="dxa"/>
+            <w:tcW w:w="6210" w:type="dxa"/>
           </w:tcPr>
           <w:p>
             <w:pPr>
@@ -2088,22 +2403,13 @@
               <w:ind w:left="360"/>
             </w:pPr>
             <w:r>
-              <w:t>As a</w:t>
-            </w:r>
-            <w:r>
-              <w:t xml:space="preserve"> user, I want to authenticate </w:t>
-            </w:r>
-            <w:r>
-              <w:t>via</w:t>
-            </w:r>
-            <w:r>
-              <w:t xml:space="preserve"> username and password.</w:t>
+              <w:t>As a new user, I want to be able to select a couple genres or answer a few questions about my taste when signing up so I can be better matched with music and friend suggestions.</w:t>
             </w:r>
           </w:p>
         </w:tc>
         <w:tc>
           <w:tcPr>
-            <w:tcW w:w="2866" w:type="dxa"/>
+            <w:tcW w:w="1345" w:type="dxa"/>
           </w:tcPr>
           <w:p>
             <w:pPr>
@@ -2119,7 +2425,7 @@
       <w:tr>
         <w:tc>
           <w:tcPr>
-            <w:tcW w:w="2898" w:type="dxa"/>
+            <w:tcW w:w="1075" w:type="dxa"/>
           </w:tcPr>
           <w:p>
             <w:pPr>
@@ -2145,7 +2451,7 @@
         </w:tc>
         <w:tc>
           <w:tcPr>
-            <w:tcW w:w="2866" w:type="dxa"/>
+            <w:tcW w:w="6210" w:type="dxa"/>
           </w:tcPr>
           <w:p>
             <w:pPr>
@@ -2153,16 +2459,125 @@
               <w:ind w:left="360"/>
             </w:pPr>
             <w:r>
-              <w:t xml:space="preserve">As a user, I want to </w:t>
-            </w:r>
-            <w:r>
-              <w:t>store workout information</w:t>
+              <w:t>As a user, I want to be able to make playlists with customizable features, so that I can set photos as playlist covers or add notes/descriptions to the playlist.</w:t>
             </w:r>
           </w:p>
         </w:tc>
         <w:tc>
           <w:tcPr>
-            <w:tcW w:w="2866" w:type="dxa"/>
+            <w:tcW w:w="1345" w:type="dxa"/>
+          </w:tcPr>
+          <w:p>
+            <w:pPr>
+              <w:spacing w:line="360" w:lineRule="auto"/>
+              <w:ind w:left="360"/>
+            </w:pPr>
+            <w:r>
+              <w:t>3</w:t>
+            </w:r>
+          </w:p>
+        </w:tc>
+      </w:tr>
+      <w:tr>
+        <w:tc>
+          <w:tcPr>
+            <w:tcW w:w="1075" w:type="dxa"/>
+          </w:tcPr>
+          <w:p>
+            <w:pPr>
+              <w:spacing w:line="360" w:lineRule="auto"/>
+              <w:rPr>
+                <w:caps/>
+                <w:u w:val="single"/>
+              </w:rPr>
+            </w:pPr>
+            <w:r>
+              <w:rPr>
+                <w:caps/>
+              </w:rPr>
+              <w:t>US-</w:t>
+            </w:r>
+            <w:r>
+              <w:rPr>
+                <w:caps/>
+              </w:rPr>
+              <w:t>03</w:t>
+            </w:r>
+          </w:p>
+        </w:tc>
+        <w:tc>
+          <w:tcPr>
+            <w:tcW w:w="6210" w:type="dxa"/>
+          </w:tcPr>
+          <w:p>
+            <w:pPr>
+              <w:spacing w:line="360" w:lineRule="auto"/>
+              <w:ind w:left="360"/>
+            </w:pPr>
+            <w:r>
+              <w:t>As a user, I want to be able to see what relevant concerts are near me, so that I won’t miss concerts or tours of some of my top artists</w:t>
+            </w:r>
+          </w:p>
+        </w:tc>
+        <w:tc>
+          <w:tcPr>
+            <w:tcW w:w="1345" w:type="dxa"/>
+          </w:tcPr>
+          <w:p>
+            <w:pPr>
+              <w:spacing w:line="360" w:lineRule="auto"/>
+              <w:ind w:left="360"/>
+            </w:pPr>
+            <w:r>
+              <w:t>3</w:t>
+            </w:r>
+          </w:p>
+        </w:tc>
+      </w:tr>
+      <w:tr>
+        <w:tc>
+          <w:tcPr>
+            <w:tcW w:w="1075" w:type="dxa"/>
+          </w:tcPr>
+          <w:p>
+            <w:pPr>
+              <w:spacing w:line="360" w:lineRule="auto"/>
+              <w:rPr>
+                <w:caps/>
+                <w:u w:val="single"/>
+              </w:rPr>
+            </w:pPr>
+            <w:r>
+              <w:rPr>
+                <w:caps/>
+              </w:rPr>
+              <w:t>US-</w:t>
+            </w:r>
+            <w:r>
+              <w:rPr>
+                <w:caps/>
+              </w:rPr>
+              <w:t>04</w:t>
+            </w:r>
+          </w:p>
+        </w:tc>
+        <w:tc>
+          <w:tcPr>
+            <w:tcW w:w="6210" w:type="dxa"/>
+          </w:tcPr>
+          <w:p>
+            <w:pPr>
+              <w:spacing w:line="360" w:lineRule="auto"/>
+              <w:ind w:left="360"/>
+            </w:pPr>
+            <w:r>
+              <w:t>As a user, I want to be able to share music with a friend one on one, so that I can send music directly.</w:t>
+            </w:r>
+          </w:p>
+        </w:tc>
+        <w:tc>
+          <w:tcPr>
+            <w:tcW w:w="1345" w:type="dxa"/>
           </w:tcPr>
           <w:p>
             <w:pPr>
@@ -2178,33 +2593,26 @@
       <w:tr>
         <w:tc>
           <w:tcPr>
-            <w:tcW w:w="2898" w:type="dxa"/>
+            <w:tcW w:w="1075" w:type="dxa"/>
           </w:tcPr>
           <w:p>
             <w:pPr>
               <w:spacing w:line="360" w:lineRule="auto"/>
               <w:rPr>
                 <w:caps/>
-                <w:u w:val="single"/>
               </w:rPr>
             </w:pPr>
             <w:r>
               <w:rPr>
                 <w:caps/>
               </w:rPr>
-              <w:t>US-</w:t>
-            </w:r>
-            <w:r>
-              <w:rPr>
-                <w:caps/>
-              </w:rPr>
-              <w:t>03</w:t>
+              <w:t>US-05</w:t>
             </w:r>
           </w:p>
         </w:tc>
         <w:tc>
           <w:tcPr>
-            <w:tcW w:w="2866" w:type="dxa"/>
+            <w:tcW w:w="6210" w:type="dxa"/>
           </w:tcPr>
           <w:p>
             <w:pPr>
@@ -2212,16 +2620,21 @@
               <w:ind w:left="360"/>
             </w:pPr>
             <w:r>
-              <w:t>As a user, I want to</w:t>
+              <w:t xml:space="preserve">As a User I want to be able to create groups and share music </w:t>
             </w:r>
+            <w:proofErr w:type="gramStart"/>
             <w:r>
-              <w:t xml:space="preserve"> search workout history</w:t>
+              <w:t>to</w:t>
+            </w:r>
+            <w:proofErr w:type="gramEnd"/>
+            <w:r>
+              <w:t xml:space="preserve"> groups, so that we can create listening groups and create a community online through music interest.</w:t>
             </w:r>
           </w:p>
         </w:tc>
         <w:tc>
           <w:tcPr>
-            <w:tcW w:w="2866" w:type="dxa"/>
+            <w:tcW w:w="1345" w:type="dxa"/>
           </w:tcPr>
           <w:p>
             <w:pPr>
@@ -2229,7 +2642,7 @@
               <w:ind w:left="360"/>
             </w:pPr>
             <w:r>
-              <w:t>3</w:t>
+              <w:t>2</w:t>
             </w:r>
           </w:p>
         </w:tc>
@@ -2237,33 +2650,26 @@
       <w:tr>
         <w:tc>
           <w:tcPr>
-            <w:tcW w:w="2898" w:type="dxa"/>
+            <w:tcW w:w="1075" w:type="dxa"/>
           </w:tcPr>
           <w:p>
             <w:pPr>
               <w:spacing w:line="360" w:lineRule="auto"/>
               <w:rPr>
                 <w:caps/>
-                <w:u w:val="single"/>
               </w:rPr>
             </w:pPr>
             <w:r>
               <w:rPr>
                 <w:caps/>
               </w:rPr>
-              <w:t>US-</w:t>
-            </w:r>
-            <w:r>
-              <w:rPr>
-                <w:caps/>
-              </w:rPr>
-              <w:t>04</w:t>
+              <w:t>US-06</w:t>
             </w:r>
           </w:p>
         </w:tc>
         <w:tc>
           <w:tcPr>
-            <w:tcW w:w="2866" w:type="dxa"/>
+            <w:tcW w:w="6210" w:type="dxa"/>
           </w:tcPr>
           <w:p>
             <w:pPr>
@@ -2271,16 +2677,13 @@
               <w:ind w:left="360"/>
             </w:pPr>
             <w:r>
-              <w:t xml:space="preserve">As a user, I want to </w:t>
-            </w:r>
-            <w:r>
-              <w:t>add new workout types.</w:t>
+              <w:t>As a user, I want to play and pause a selected song so that I can listen to music shared through the application.</w:t>
             </w:r>
           </w:p>
         </w:tc>
         <w:tc>
           <w:tcPr>
-            <w:tcW w:w="2866" w:type="dxa"/>
+            <w:tcW w:w="1345" w:type="dxa"/>
           </w:tcPr>
           <w:p>
             <w:pPr>
@@ -2288,7 +2691,211 @@
               <w:ind w:left="360"/>
             </w:pPr>
             <w:r>
-              <w:t>4</w:t>
+              <w:t>1</w:t>
+            </w:r>
+          </w:p>
+        </w:tc>
+      </w:tr>
+      <w:tr>
+        <w:tc>
+          <w:tcPr>
+            <w:tcW w:w="1075" w:type="dxa"/>
+          </w:tcPr>
+          <w:p>
+            <w:pPr>
+              <w:spacing w:line="360" w:lineRule="auto"/>
+              <w:rPr>
+                <w:caps/>
+              </w:rPr>
+            </w:pPr>
+            <w:r>
+              <w:rPr>
+                <w:caps/>
+              </w:rPr>
+              <w:t>US-07</w:t>
+            </w:r>
+          </w:p>
+        </w:tc>
+        <w:tc>
+          <w:tcPr>
+            <w:tcW w:w="6210" w:type="dxa"/>
+          </w:tcPr>
+          <w:p>
+            <w:pPr>
+              <w:spacing w:line="360" w:lineRule="auto"/>
+              <w:ind w:left="360"/>
+            </w:pPr>
+            <w:r>
+              <w:t>As a user, I want to add friends or accept friend requests so that I can share and discover music through my social circle.</w:t>
+            </w:r>
+          </w:p>
+        </w:tc>
+        <w:tc>
+          <w:tcPr>
+            <w:tcW w:w="1345" w:type="dxa"/>
+          </w:tcPr>
+          <w:p>
+            <w:pPr>
+              <w:spacing w:line="360" w:lineRule="auto"/>
+              <w:ind w:left="360"/>
+            </w:pPr>
+            <w:r>
+              <w:t>1</w:t>
+            </w:r>
+          </w:p>
+        </w:tc>
+      </w:tr>
+      <w:tr>
+        <w:tc>
+          <w:tcPr>
+            <w:tcW w:w="1075" w:type="dxa"/>
+          </w:tcPr>
+          <w:p>
+            <w:pPr>
+              <w:spacing w:line="360" w:lineRule="auto"/>
+              <w:rPr>
+                <w:caps/>
+              </w:rPr>
+            </w:pPr>
+            <w:r>
+              <w:rPr>
+                <w:caps/>
+              </w:rPr>
+              <w:t>US-08</w:t>
+            </w:r>
+          </w:p>
+        </w:tc>
+        <w:tc>
+          <w:tcPr>
+            <w:tcW w:w="6210" w:type="dxa"/>
+          </w:tcPr>
+          <w:p>
+            <w:pPr>
+              <w:spacing w:line="360" w:lineRule="auto"/>
+              <w:ind w:left="360"/>
+            </w:pPr>
+            <w:r>
+              <w:t>As a user, I want to view my listening history so that I can see what I listened to and maybe listen to it again.</w:t>
+            </w:r>
+          </w:p>
+        </w:tc>
+        <w:tc>
+          <w:tcPr>
+            <w:tcW w:w="1345" w:type="dxa"/>
+          </w:tcPr>
+          <w:p>
+            <w:pPr>
+              <w:spacing w:line="360" w:lineRule="auto"/>
+              <w:ind w:left="360"/>
+            </w:pPr>
+            <w:r>
+              <w:t>1</w:t>
+            </w:r>
+          </w:p>
+        </w:tc>
+      </w:tr>
+      <w:tr>
+        <w:tc>
+          <w:tcPr>
+            <w:tcW w:w="1075" w:type="dxa"/>
+          </w:tcPr>
+          <w:p>
+            <w:pPr>
+              <w:spacing w:line="360" w:lineRule="auto"/>
+              <w:rPr>
+                <w:caps/>
+              </w:rPr>
+            </w:pPr>
+            <w:r>
+              <w:rPr>
+                <w:caps/>
+              </w:rPr>
+              <w:t>US-09</w:t>
+            </w:r>
+          </w:p>
+        </w:tc>
+        <w:tc>
+          <w:tcPr>
+            <w:tcW w:w="6210" w:type="dxa"/>
+          </w:tcPr>
+          <w:p>
+            <w:pPr>
+              <w:spacing w:line="360" w:lineRule="auto"/>
+              <w:ind w:left="360"/>
+            </w:pPr>
+            <w:r>
+              <w:t>As a user, I want to react to or comment on a shared song so that I can discuss music with friends.</w:t>
+            </w:r>
+          </w:p>
+        </w:tc>
+        <w:tc>
+          <w:tcPr>
+            <w:tcW w:w="1345" w:type="dxa"/>
+          </w:tcPr>
+          <w:p>
+            <w:pPr>
+              <w:spacing w:line="360" w:lineRule="auto"/>
+              <w:ind w:left="360"/>
+            </w:pPr>
+            <w:r>
+              <w:t>2</w:t>
+            </w:r>
+          </w:p>
+        </w:tc>
+      </w:tr>
+      <w:tr>
+        <w:tc>
+          <w:tcPr>
+            <w:tcW w:w="1075" w:type="dxa"/>
+          </w:tcPr>
+          <w:p>
+            <w:pPr>
+              <w:spacing w:line="360" w:lineRule="auto"/>
+              <w:rPr>
+                <w:caps/>
+              </w:rPr>
+            </w:pPr>
+            <w:r>
+              <w:rPr>
+                <w:caps/>
+              </w:rPr>
+              <w:t>US-10</w:t>
+            </w:r>
+          </w:p>
+        </w:tc>
+        <w:tc>
+          <w:tcPr>
+            <w:tcW w:w="6210" w:type="dxa"/>
+          </w:tcPr>
+          <w:p>
+            <w:pPr>
+              <w:tabs>
+                <w:tab w:val="left" w:pos="1920"/>
+              </w:tabs>
+              <w:spacing w:line="360" w:lineRule="auto"/>
+              <w:ind w:left="360"/>
+            </w:pPr>
+            <w:r>
+              <w:t xml:space="preserve">As a user, I want to have links and metadata to shared music so that I can easily access the shared song I want to </w:t>
+            </w:r>
+            <w:r>
+              <w:lastRenderedPageBreak/>
+              <w:t>listen to.</w:t>
+            </w:r>
+          </w:p>
+        </w:tc>
+        <w:tc>
+          <w:tcPr>
+            <w:tcW w:w="1345" w:type="dxa"/>
+          </w:tcPr>
+          <w:p>
+            <w:pPr>
+              <w:spacing w:line="360" w:lineRule="auto"/>
+              <w:ind w:left="360"/>
+            </w:pPr>
+            <w:r>
+              <w:lastRenderedPageBreak/>
+              <w:t>2</w:t>
             </w:r>
           </w:p>
         </w:tc>
@@ -2503,11 +3110,7 @@
               <w:ind w:left="360"/>
             </w:pPr>
             <w:r>
-              <w:t xml:space="preserve">Allow users to store </w:t>
-            </w:r>
-            <w:r>
-              <w:lastRenderedPageBreak/>
-              <w:t>workout information</w:t>
+              <w:t>Allow users to store workout information</w:t>
             </w:r>
           </w:p>
         </w:tc>
@@ -2521,7 +3124,6 @@
               <w:ind w:left="360"/>
             </w:pPr>
             <w:r>
-              <w:lastRenderedPageBreak/>
               <w:t>1</w:t>
             </w:r>
           </w:p>
@@ -3317,11 +3919,7 @@
               <w:ind w:left="360"/>
             </w:pPr>
             <w:r>
-              <w:t xml:space="preserve">Allow users to search </w:t>
-            </w:r>
-            <w:r>
-              <w:lastRenderedPageBreak/>
-              <w:t>their workout history</w:t>
+              <w:t>Allow users to search their workout history</w:t>
             </w:r>
           </w:p>
         </w:tc>
@@ -3335,7 +3933,6 @@
               <w:ind w:left="360"/>
             </w:pPr>
             <w:r>
-              <w:lastRenderedPageBreak/>
               <w:t>46</w:t>
             </w:r>
           </w:p>
@@ -3459,7 +4056,14 @@
           <w:caps/>
           <w:u w:val="single"/>
         </w:rPr>
-        <w:t xml:space="preserve"> [e.g., Claude 3.5, GPT-4o]</w:t>
+        <w:t xml:space="preserve"> </w:t>
+      </w:r>
+      <w:r>
+        <w:rPr>
+          <w:caps/>
+          <w:u w:val="single"/>
+        </w:rPr>
+        <w:t>CLaude, chatgpt 5.6 Terra</w:t>
       </w:r>
     </w:p>
     <w:p>
@@ -7217,15 +7821,6 @@
 </file>
 
 <file path=customXml/item1.xml><?xml version="1.0" encoding="utf-8"?>
-<?mso-contentType ?>
-<FormTemplates xmlns="http://schemas.microsoft.com/sharepoint/v3/contenttype/forms">
-  <Display>DocumentLibraryForm</Display>
-  <Edit>DocumentLibraryForm</Edit>
-  <New>DocumentLibraryForm</New>
-</FormTemplates>
-</file>
-
-<file path=customXml/item2.xml><?xml version="1.0" encoding="utf-8"?>
 <ct:contentTypeSchema xmlns:ct="http://schemas.microsoft.com/office/2006/metadata/contentType" xmlns:ma="http://schemas.microsoft.com/office/2006/metadata/properties/metaAttributes" ct:_="" ma:_="" ma:contentTypeName="Document" ma:contentTypeID="0x010100945A0BED1FF22141923A01E10AB34E97" ma:contentTypeVersion="20" ma:contentTypeDescription="Create a new document." ma:contentTypeScope="" ma:versionID="342f3b0d3be1606ff63d7fcf931b7159">
   <xsd:schema xmlns:xsd="http://www.w3.org/2001/XMLSchema" xmlns:xs="http://www.w3.org/2001/XMLSchema" xmlns:p="http://schemas.microsoft.com/office/2006/metadata/properties" xmlns:ns2="465633ec-d69e-42ae-b4b0-0dce57937a5a" xmlns:ns3="27242fef-9cfa-4fe3-8653-3bd28d129dca" targetNamespace="http://schemas.microsoft.com/office/2006/metadata/properties" ma:root="true" ma:fieldsID="45ee47de61fb45f165f6a3972bd1001e" ns2:_="" ns3:_="">
     <xsd:import namespace="465633ec-d69e-42ae-b4b0-0dce57937a5a"/>
@@ -7900,6 +8495,15 @@
 </ct:contentTypeSchema>
 </file>
 
+<file path=customXml/item2.xml><?xml version="1.0" encoding="utf-8"?>
+<?mso-contentType ?>
+<FormTemplates xmlns="http://schemas.microsoft.com/sharepoint/v3/contenttype/forms">
+  <Display>DocumentLibraryForm</Display>
+  <Edit>DocumentLibraryForm</Edit>
+  <New>DocumentLibraryForm</New>
+</FormTemplates>
+</file>
+
 <file path=customXml/item3.xml><?xml version="1.0" encoding="utf-8"?>
 <p:properties xmlns:p="http://schemas.microsoft.com/office/2006/metadata/properties" xmlns:xsi="http://www.w3.org/2001/XMLSchema-instance" xmlns:pc="http://schemas.microsoft.com/office/infopath/2007/PartnerControls">
   <documentManagement>
@@ -7926,14 +8530,6 @@
 </file>
 
 <file path=customXml/itemProps1.xml><?xml version="1.0" encoding="utf-8"?>
-<ds:datastoreItem xmlns:ds="http://schemas.openxmlformats.org/officeDocument/2006/customXml" ds:itemID="{030D5295-6A79-42C5-A0B7-1016DED61AA1}">
-  <ds:schemaRefs>
-    <ds:schemaRef ds:uri="http://schemas.microsoft.com/sharepoint/v3/contenttype/forms"/>
-  </ds:schemaRefs>
-</ds:datastoreItem>
-</file>
-
-<file path=customXml/itemProps2.xml><?xml version="1.0" encoding="utf-8"?>
 <ds:datastoreItem xmlns:ds="http://schemas.openxmlformats.org/officeDocument/2006/customXml" ds:itemID="{AEA02465-052C-48FD-BB64-7A67B58A3425}">
   <ds:schemaRefs>
     <ds:schemaRef ds:uri="http://schemas.microsoft.com/office/2006/metadata/contentType"/>
@@ -7952,6 +8548,14 @@
 </ds:datastoreItem>
 </file>
 
+<file path=customXml/itemProps2.xml><?xml version="1.0" encoding="utf-8"?>
+<ds:datastoreItem xmlns:ds="http://schemas.openxmlformats.org/officeDocument/2006/customXml" ds:itemID="{030D5295-6A79-42C5-A0B7-1016DED61AA1}">
+  <ds:schemaRefs>
+    <ds:schemaRef ds:uri="http://schemas.microsoft.com/sharepoint/v3/contenttype/forms"/>
+  </ds:schemaRefs>
+</ds:datastoreItem>
+</file>
+
 <file path=customXml/itemProps3.xml><?xml version="1.0" encoding="utf-8"?>
 <ds:datastoreItem xmlns:ds="http://schemas.openxmlformats.org/officeDocument/2006/customXml" ds:itemID="{BBE85EB1-7069-4C57-AAD6-F91878A3B1CC}">
   <ds:schemaRefs>

</xml_diff>